<commit_message>
Use solo wording across the README, decks, PDFs, demo pages and video
</commit_message>
<xml_diff>
--- a/docs/project/OwlContinuity_Demo_Guide.docx
+++ b/docs/project/OwlContinuity_Demo_Guide.docx
@@ -24,7 +24,7 @@
           <w:b w:val="0"/>
           <w:i w:val="0"/>
         </w:rPr>
-        <w:t>Team OwlContinuity: Tanvir Anjum Joarder</w:t>
+        <w:t>Tanvir Anjum Joarder</w:t>
       </w:r>
     </w:p>
     <w:p>
@@ -1033,7 +1033,7 @@
           <w:b w:val="0"/>
           <w:i w:val="0"/>
         </w:rPr>
-        <w:t>2. If it fails again, say "This is a recorded run from our testing." The full deck (OwlContinuity_Final_Pitch_Designed_v6.pptx) has the recorded runs on hidden slides 38 to 44.</w:t>
+        <w:t>2. If it fails again, say "This is a recorded run from my testing." The detailed deck (deck/OwlContinuity_Detailed_Deck.pptx) has the recorded runs on slides 42 to 48.</w:t>
       </w:r>
     </w:p>
     <w:p>

</xml_diff>